<commit_message>
Docs and workbook for v4.1; CI actions on Node 24; corrected Eurostat rounding
Co-Authored-By: Claude Opus 5.5 <noreply@anthropic.com>
</commit_message>
<xml_diff>
--- a/docs/methodology/ITEA_v4_0_Methodology_EN.docx
+++ b/docs/methodology/ITEA_v4_0_Methodology_EN.docx
@@ -2469,7 +2469,65 @@
           <w:bCs/>
           <w:lang w:val="en"/>
         </w:rPr>
-        <w:t xml:space="preserve">Pending:</w:t>
+        <w:t xml:space="preserve">Layer 2 (semantic), done:</w:t>
+      </w:r>
+      <w:r>
+        <w:rPr>
+          <w:lang w:val="en"/>
+        </w:rPr>
+        <w:t xml:space="preserve"> </w:t>
+      </w:r>
+      <w:r>
+        <w:rPr>
+          <w:lang w:val="en"/>
+        </w:rPr>
+        <w:t xml:space="preserve">each task is linked to its 5 nearest ESCO concepts with sentence embeddings (all-mpnet-base-v2, run locally). 68 % of the variance of K2 lies within activities (5 % for K1), and K2 is less tied to skill level (ρ = 0.49 with Job Zone).</w:t>
+      </w:r>
+    </w:p>
+    <w:p>
+      <w:pPr>
+        <w:pStyle w:val="Compact"/>
+        <w:numPr>
+          <w:ilvl w:val="0"/>
+          <w:numId w:val="1011"/>
+        </w:numPr>
+      </w:pPr>
+      <w:r>
+        <w:rPr>
+          <w:b/>
+          <w:bCs/>
+          <w:lang w:val="en"/>
+        </w:rPr>
+        <w:t xml:space="preserve">Layer 3 (NLI anchors), negative result:</w:t>
+      </w:r>
+      <w:r>
+        <w:rPr>
+          <w:lang w:val="en"/>
+        </w:rPr>
+        <w:t xml:space="preserve"> </w:t>
+      </w:r>
+      <w:r>
+        <w:rPr>
+          <w:lang w:val="en"/>
+        </w:rPr>
+        <w:t xml:space="preserve">it fails its four hypotheses and is not used.</w:t>
+      </w:r>
+    </w:p>
+    <w:p>
+      <w:pPr>
+        <w:pStyle w:val="Compact"/>
+        <w:numPr>
+          <w:ilvl w:val="0"/>
+          <w:numId w:val="1011"/>
+        </w:numPr>
+      </w:pPr>
+      <w:r>
+        <w:rPr>
+          <w:b/>
+          <w:bCs/>
+          <w:lang w:val="en"/>
+        </w:rPr>
+        <w:t xml:space="preserve">OAXI-EU v4.1, built:</w:t>
       </w:r>
     </w:p>
     <w:p>
@@ -2484,7 +2542,7 @@
         <w:rPr>
           <w:lang w:val="en"/>
         </w:rPr>
-        <w:t xml:space="preserve">semantic layers (ESCO embeddings and anchored zero-shot classification);</w:t>
+        <w:t xml:space="preserve">components: K = K1 + K2 and E = E1 + E2;</w:t>
       </w:r>
     </w:p>
     <w:p>
@@ -2499,7 +2557,7 @@
         <w:rPr>
           <w:lang w:val="en"/>
         </w:rPr>
-        <w:t xml:space="preserve">layers S and C;</w:t>
+        <w:t xml:space="preserve">uncertainty: a 1,000-draw Monte Carlo with a 5–95 % band per group (median: 66 of 428 places);</w:t>
       </w:r>
     </w:p>
     <w:p>
@@ -2514,7 +2572,7 @@
         <w:rPr>
           <w:lang w:val="en"/>
         </w:rPr>
-        <w:t xml:space="preserve">a JRC-COIN-style composite with Monte Carlo;</w:t>
+        <w:t xml:space="preserve">validation: final E vs Eloundou ρ = 0.45, and final K vs analytical work within Job Zone 0.26;</w:t>
       </w:r>
     </w:p>
     <w:p>
@@ -2529,7 +2587,36 @@
         <w:rPr>
           <w:lang w:val="en"/>
         </w:rPr>
-        <w:t xml:space="preserve">the rebuild of OAXI-EU.</w:t>
+        <w:t xml:space="preserve">against the v4.0 index: Spearman 0.80. The largest uncertainty comes from E, whose two sources agree weakly.</w:t>
+      </w:r>
+    </w:p>
+    <w:p>
+      <w:pPr>
+        <w:pStyle w:val="Compact"/>
+        <w:numPr>
+          <w:ilvl w:val="0"/>
+          <w:numId w:val="1011"/>
+        </w:numPr>
+      </w:pPr>
+      <w:r>
+        <w:rPr>
+          <w:b/>
+          <w:bCs/>
+          <w:lang w:val="en"/>
+        </w:rPr>
+        <w:t xml:space="preserve">Pending:</w:t>
+      </w:r>
+      <w:r>
+        <w:rPr>
+          <w:lang w:val="en"/>
+        </w:rPr>
+        <w:t xml:space="preserve"> </w:t>
+      </w:r>
+      <w:r>
+        <w:rPr>
+          <w:lang w:val="en"/>
+        </w:rPr>
+        <w:t xml:space="preserve">layers T, S and C.</w:t>
       </w:r>
     </w:p>
     <w:p>

</xml_diff>